<commit_message>
fix: secure sub-admin access and update admin orders
</commit_message>
<xml_diff>
--- a/docs/HSHIP_HUONG_DAN_SU_DUNG_VA_BAN_GIAO_A_Z_FINAL.docx
+++ b/docs/HSHIP_HUONG_DAN_SU_DUNG_VA_BAN_GIAO_A_Z_FINAL.docx
@@ -358,7 +358,29 @@
           <w:numId w:val="3"/>
         </w:numPr>
       </w:pPr>
-      <w:hyperlink w:history="1" w:anchor="11-production-credential-center">
+      <w:hyperlink w:history="1" w:anchor="11-quản-lý-đơn-hàng-uship-layout-và-đối-soát">
+        <w:r>
+          <w:rPr>
+            <w:u w:val="single"/>
+          </w:rPr>
+          <w:t xml:space="preserve">Quản lý đơn hàng (Uship Layout) và Đối soát</w:t>
+        </w:r>
+      </w:hyperlink>
+    </w:p>
+    <w:p>
+      <w:pPr>
+        <w:pStyle w:val="ListParagraph"/>
+        <w:pStyle w:val="ListParagraph"/>
+        <w:numPr>
+          <w:ilvl w:val="0"/>
+          <w:numId w:val="1"/>
+        </w:numPr>
+        <w:numPr>
+          <w:ilvl w:val="0"/>
+          <w:numId w:val="3"/>
+        </w:numPr>
+      </w:pPr>
+      <w:hyperlink w:history="1" w:anchor="12-production-credential-center">
         <w:r>
           <w:rPr>
             <w:u w:val="single"/>
@@ -380,7 +402,7 @@
           <w:numId w:val="3"/>
         </w:numPr>
       </w:pPr>
-      <w:hyperlink w:history="1" w:anchor="12-crm-khách-hàng-và-blacklist">
+      <w:hyperlink w:history="1" w:anchor="13-crm-khách-hàng-và-blacklist">
         <w:r>
           <w:rPr>
             <w:u w:val="single"/>
@@ -402,7 +424,7 @@
           <w:numId w:val="3"/>
         </w:numPr>
       </w:pPr>
-      <w:hyperlink w:history="1" w:anchor="13-dashboard--báo-cáo">
+      <w:hyperlink w:history="1" w:anchor="14-dashboard--báo-cáo">
         <w:r>
           <w:rPr>
             <w:u w:val="single"/>
@@ -424,7 +446,7 @@
           <w:numId w:val="3"/>
         </w:numPr>
       </w:pPr>
-      <w:hyperlink w:history="1" w:anchor="14-checklist-uat-cho-khách">
+      <w:hyperlink w:history="1" w:anchor="15-checklist-uat-cho-khách">
         <w:r>
           <w:rPr>
             <w:u w:val="single"/>
@@ -446,7 +468,7 @@
           <w:numId w:val="3"/>
         </w:numPr>
       </w:pPr>
-      <w:hyperlink w:history="1" w:anchor="15-lỗi-thường-gặp-và-cách-xử-lý">
+      <w:hyperlink w:history="1" w:anchor="16-lỗi-thường-gặp-và-cách-xử-lý">
         <w:r>
           <w:rPr>
             <w:u w:val="single"/>
@@ -468,7 +490,7 @@
           <w:numId w:val="3"/>
         </w:numPr>
       </w:pPr>
-      <w:hyperlink w:history="1" w:anchor="16-backup--restore--vận-hành">
+      <w:hyperlink w:history="1" w:anchor="17-backup--restore--vận-hành">
         <w:r>
           <w:rPr>
             <w:u w:val="single"/>
@@ -490,7 +512,7 @@
           <w:numId w:val="3"/>
         </w:numPr>
       </w:pPr>
-      <w:hyperlink w:history="1" w:anchor="17-bảo-mật">
+      <w:hyperlink w:history="1" w:anchor="18-bảo-mật">
         <w:r>
           <w:rPr>
             <w:u w:val="single"/>
@@ -512,7 +534,7 @@
           <w:numId w:val="3"/>
         </w:numPr>
       </w:pPr>
-      <w:hyperlink w:history="1" w:anchor="18-tóm-tắt-kiểm-tra-production">
+      <w:hyperlink w:history="1" w:anchor="19-tóm-tắt-kiểm-tra-production">
         <w:r>
           <w:rPr>
             <w:u w:val="single"/>
@@ -3072,13 +3094,38 @@
       <w:pPr>
         <w:pStyle w:val="Heading1"/>
       </w:pPr>
-      <w:bookmarkStart w:name="11-production-credential-center" w:id="1"/>
-      <w:r>
-        <w:t xml:space="preserve">11. Production Credential Center</w:t>
+      <w:bookmarkStart w:name="11-quản-lý-đơn-hàng-(uship-layout)-và-đối-soát" w:id="1"/>
+      <w:r>
+        <w:t xml:space="preserve">11. Quản lý đơn hàng (Uship Layout) và Đối soát</w:t>
       </w:r>
       <w:bookmarkEnd w:id="1"/>
     </w:p>
     <w:p>
+      <w:r>
+        <w:t xml:space="preserve">Màn hình </w:t>
+      </w:r>
+      <w:r>
+        <w:rPr>
+          <w:b/>
+          <w:bCs/>
+        </w:rPr>
+        <w:t xml:space="preserve">Danh sách đơn hàng</w:t>
+      </w:r>
+      <w:r>
+        <w:t xml:space="preserve"> (Dành cho Admin và Shop) được thiết kế hiện đại, cung cấp khả năng lọc và đối soát chuyên sâu.</w:t>
+      </w:r>
+    </w:p>
+    <w:p>
+      <w:pPr>
+        <w:pStyle w:val="Heading2"/>
+      </w:pPr>
+      <w:bookmarkStart w:name="các-tính-năng-chính:" w:id="1"/>
+      <w:r>
+        <w:t xml:space="preserve">Các tính năng chính:</w:t>
+      </w:r>
+      <w:bookmarkEnd w:id="1"/>
+    </w:p>
+    <w:p>
       <w:pPr>
         <w:pStyle w:val="ListParagraph"/>
         <w:pStyle w:val="ListParagraph"/>
@@ -3096,10 +3143,10 @@
           <w:b/>
           <w:bCs/>
         </w:rPr>
-        <w:t xml:space="preserve">Khái niệm:</w:t>
-      </w:r>
-      <w:r>
-        <w:t xml:space="preserve"> API key/credential là thông tin kết nối thật với đơn vị vận chuyển/nền tảng bên thứ ba (GHTK, GHN, J&amp;T).</w:t>
+        <w:t xml:space="preserve">Nội dung hàng hoá</w:t>
+      </w:r>
+      <w:r>
+        <w:t xml:space="preserve">: Khi tạo đơn, Shop có thể nhập Nội dung hàng hóa (Ví dụ: Áo thun, mỹ phẩm...). Thông tin này hiển thị rõ ràng trên cột "Nội dung hàng hoá".</w:t>
       </w:r>
     </w:p>
     <w:p>
@@ -3116,14 +3163,202 @@
         </w:numPr>
       </w:pPr>
       <w:r>
-        <w:t xml:space="preserve">Nếu thiếu thông tin này, hệ thống sẽ báo </w:t>
-      </w:r>
+        <w:rPr>
+          <w:b/>
+          <w:bCs/>
+        </w:rPr>
+        <w:t xml:space="preserve">Lọc Đối soát</w:t>
+      </w:r>
+      <w:r>
+        <w:t xml:space="preserve">: Hệ thống có menu dropdown Đối soát để lọc:</w:t>
+      </w:r>
+    </w:p>
+    <w:p>
+      <w:pPr>
+        <w:pStyle w:val="ListParagraph"/>
+        <w:pStyle w:val="ListParagraph"/>
+        <w:numPr>
+          <w:ilvl w:val="1"/>
+          <w:numId w:val="1"/>
+        </w:numPr>
+        <w:numPr>
+          <w:ilvl w:val="1"/>
+          <w:numId w:val="21"/>
+        </w:numPr>
+      </w:pPr>
       <w:r>
         <w:rPr>
           <w:rStyle w:val="code"/>
           <w:rFonts w:ascii="Consolas" w:cs="Consolas" w:eastAsia="Consolas" w:hAnsi="Consolas"/>
         </w:rPr>
-        <w:t xml:space="preserve">MISSING_CREDENTIALS</w:t>
+        <w:t xml:space="preserve">Chờ đối soát</w:t>
+      </w:r>
+      <w:r>
+        <w:t xml:space="preserve">: Lọc ra các đơn hàng chưa đối soát.</w:t>
+      </w:r>
+    </w:p>
+    <w:p>
+      <w:pPr>
+        <w:pStyle w:val="ListParagraph"/>
+        <w:pStyle w:val="ListParagraph"/>
+        <w:numPr>
+          <w:ilvl w:val="1"/>
+          <w:numId w:val="1"/>
+        </w:numPr>
+        <w:numPr>
+          <w:ilvl w:val="1"/>
+          <w:numId w:val="21"/>
+        </w:numPr>
+      </w:pPr>
+      <w:r>
+        <w:rPr>
+          <w:rStyle w:val="code"/>
+          <w:rFonts w:ascii="Consolas" w:cs="Consolas" w:eastAsia="Consolas" w:hAnsi="Consolas"/>
+        </w:rPr>
+        <w:t xml:space="preserve">Đã đối soát</w:t>
+      </w:r>
+      <w:r>
+        <w:t xml:space="preserve">: Lọc ra các đơn hàng đã đối soát xong.</w:t>
+      </w:r>
+    </w:p>
+    <w:p>
+      <w:pPr>
+        <w:pStyle w:val="ListParagraph"/>
+        <w:pStyle w:val="ListParagraph"/>
+        <w:numPr>
+          <w:ilvl w:val="1"/>
+          <w:numId w:val="1"/>
+        </w:numPr>
+        <w:numPr>
+          <w:ilvl w:val="1"/>
+          <w:numId w:val="21"/>
+        </w:numPr>
+      </w:pPr>
+      <w:r>
+        <w:t xml:space="preserve">Chọn cả hai hoặc không chọn gì sẽ hiển thị toàn bộ đơn.</w:t>
+      </w:r>
+    </w:p>
+    <w:p>
+      <w:pPr>
+        <w:pStyle w:val="ListParagraph"/>
+        <w:pStyle w:val="ListParagraph"/>
+        <w:numPr>
+          <w:ilvl w:val="0"/>
+          <w:numId w:val="1"/>
+        </w:numPr>
+        <w:numPr>
+          <w:ilvl w:val="0"/>
+          <w:numId w:val="20"/>
+        </w:numPr>
+      </w:pPr>
+      <w:r>
+        <w:rPr>
+          <w:b/>
+          <w:bCs/>
+        </w:rPr>
+        <w:t xml:space="preserve">Lọc Nâng cao</w:t>
+      </w:r>
+      <w:r>
+        <w:t xml:space="preserve">:</w:t>
+      </w:r>
+    </w:p>
+    <w:p>
+      <w:pPr>
+        <w:pStyle w:val="ListParagraph"/>
+        <w:pStyle w:val="ListParagraph"/>
+        <w:numPr>
+          <w:ilvl w:val="1"/>
+          <w:numId w:val="1"/>
+        </w:numPr>
+        <w:numPr>
+          <w:ilvl w:val="1"/>
+          <w:numId w:val="22"/>
+        </w:numPr>
+      </w:pPr>
+      <w:r>
+        <w:t xml:space="preserve">Trạng thái đơn (Đơn nháp, Đang giao, Đã giao, Hoàn hàng...)</w:t>
+      </w:r>
+    </w:p>
+    <w:p>
+      <w:pPr>
+        <w:pStyle w:val="ListParagraph"/>
+        <w:pStyle w:val="ListParagraph"/>
+        <w:numPr>
+          <w:ilvl w:val="1"/>
+          <w:numId w:val="1"/>
+        </w:numPr>
+        <w:numPr>
+          <w:ilvl w:val="1"/>
+          <w:numId w:val="22"/>
+        </w:numPr>
+      </w:pPr>
+      <w:r>
+        <w:t xml:space="preserve">Trạng thái COD (Đang thu, Đã thu, Đã đối soát...)</w:t>
+      </w:r>
+    </w:p>
+    <w:p>
+      <w:pPr>
+        <w:pStyle w:val="ListParagraph"/>
+        <w:pStyle w:val="ListParagraph"/>
+        <w:numPr>
+          <w:ilvl w:val="1"/>
+          <w:numId w:val="1"/>
+        </w:numPr>
+        <w:numPr>
+          <w:ilvl w:val="1"/>
+          <w:numId w:val="22"/>
+        </w:numPr>
+      </w:pPr>
+      <w:r>
+        <w:t xml:space="preserve">Đơn vị vận chuyển (GHN, SPX, J&amp;T...)</w:t>
+      </w:r>
+    </w:p>
+    <w:p>
+      <w:pPr>
+        <w:pStyle w:val="ListParagraph"/>
+        <w:pStyle w:val="ListParagraph"/>
+        <w:numPr>
+          <w:ilvl w:val="1"/>
+          <w:numId w:val="1"/>
+        </w:numPr>
+        <w:numPr>
+          <w:ilvl w:val="1"/>
+          <w:numId w:val="22"/>
+        </w:numPr>
+      </w:pPr>
+      <w:r>
+        <w:t xml:space="preserve">Lọc theo ngày.</w:t>
+      </w:r>
+    </w:p>
+    <w:p>
+      <w:pPr>
+        <w:pStyle w:val="ListParagraph"/>
+        <w:pStyle w:val="ListParagraph"/>
+        <w:numPr>
+          <w:ilvl w:val="0"/>
+          <w:numId w:val="1"/>
+        </w:numPr>
+        <w:numPr>
+          <w:ilvl w:val="0"/>
+          <w:numId w:val="20"/>
+        </w:numPr>
+      </w:pPr>
+      <w:r>
+        <w:rPr>
+          <w:b/>
+          <w:bCs/>
+        </w:rPr>
+        <w:t xml:space="preserve">Thẻ Thống kê (Summary Cards)</w:t>
+      </w:r>
+      <w:r>
+        <w:t xml:space="preserve">: Hệ thống tự động tính tổng Số lượng đơn, Tổng giá trị đơn hàng, Tổng tiền thu hộ (COD) và Tổng phí dịch vụ giao hàng </w:t>
+      </w:r>
+      <w:r>
+        <w:rPr>
+          <w:b/>
+          <w:bCs/>
+        </w:rPr>
+        <w:t xml:space="preserve">Dựa trên dữ liệu đang được lọc</w:t>
       </w:r>
       <w:r>
         <w:t xml:space="preserve">.</w:t>
@@ -3147,20 +3382,91 @@
           <w:b/>
           <w:bCs/>
         </w:rPr>
-        <w:t xml:space="preserve">Lưu ý:</w:t>
-      </w:r>
-      <w:r>
-        <w:t xml:space="preserve"> Đây </w:t>
-      </w:r>
-      <w:r>
-        <w:rPr>
-          <w:b/>
-          <w:bCs/>
-        </w:rPr>
-        <w:t xml:space="preserve">không phải lỗi phần mềm</w:t>
-      </w:r>
-      <w:r>
-        <w:t xml:space="preserve">. Khi nhập đủ API key thật, hệ thống mới có thể đẩy vận chuyển thật (Không fake success).</w:t>
+        <w:t xml:space="preserve">Xuất Excel</w:t>
+      </w:r>
+      <w:r>
+        <w:t xml:space="preserve">: Cho phép tải xuống file </w:t>
+      </w:r>
+      <w:r>
+        <w:rPr>
+          <w:rStyle w:val="code"/>
+          <w:rFonts w:ascii="Consolas" w:cs="Consolas" w:eastAsia="Consolas" w:hAnsi="Consolas"/>
+        </w:rPr>
+        <w:t xml:space="preserve">.csv</w:t>
+      </w:r>
+      <w:r>
+        <w:t xml:space="preserve"> danh sách đơn hàng dựa trên các bộ lọc hiện tại, hỗ trợ đầy đủ các trường nội dung hàng hóa và đối soát.</w:t>
+      </w:r>
+    </w:p>
+    <w:p>
+      <w:pPr>
+        <w:pStyle w:val="Heading2"/>
+      </w:pPr>
+      <w:bookmarkStart w:name="quyền-hạn-đối-soát:" w:id="1"/>
+      <w:r>
+        <w:t xml:space="preserve">Quyền hạn Đối soát:</w:t>
+      </w:r>
+      <w:bookmarkEnd w:id="1"/>
+    </w:p>
+    <w:p>
+      <w:pPr>
+        <w:pStyle w:val="ListParagraph"/>
+        <w:pStyle w:val="ListParagraph"/>
+        <w:numPr>
+          <w:ilvl w:val="0"/>
+          <w:numId w:val="1"/>
+        </w:numPr>
+        <w:numPr>
+          <w:ilvl w:val="0"/>
+          <w:numId w:val="23"/>
+        </w:numPr>
+      </w:pPr>
+      <w:r>
+        <w:t xml:space="preserve">Chỉ </w:t>
+      </w:r>
+      <w:r>
+        <w:rPr>
+          <w:b/>
+          <w:bCs/>
+        </w:rPr>
+        <w:t xml:space="preserve">Admin tổng</w:t>
+      </w:r>
+      <w:r>
+        <w:t xml:space="preserve"> và </w:t>
+      </w:r>
+      <w:r>
+        <w:rPr>
+          <w:b/>
+          <w:bCs/>
+        </w:rPr>
+        <w:t xml:space="preserve">Admin con</w:t>
+      </w:r>
+      <w:r>
+        <w:t xml:space="preserve"> (quản lý shop đó) mới có thể chọn các đơn hàng và bấm "Đánh dấu đã đối soát".</w:t>
+      </w:r>
+    </w:p>
+    <w:p>
+      <w:pPr>
+        <w:pStyle w:val="ListParagraph"/>
+        <w:pStyle w:val="ListParagraph"/>
+        <w:numPr>
+          <w:ilvl w:val="0"/>
+          <w:numId w:val="1"/>
+        </w:numPr>
+        <w:numPr>
+          <w:ilvl w:val="0"/>
+          <w:numId w:val="23"/>
+        </w:numPr>
+      </w:pPr>
+      <w:r>
+        <w:rPr>
+          <w:b/>
+          <w:bCs/>
+        </w:rPr>
+        <w:t xml:space="preserve">Shop</w:t>
+      </w:r>
+      <w:r>
+        <w:t xml:space="preserve"> chỉ có quyền xem trạng thái, không thể tự đối soát đơn hàng.</w:t>
       </w:r>
     </w:p>
     <w:p>
@@ -3174,9 +3480,9 @@
       <w:pPr>
         <w:pStyle w:val="Heading1"/>
       </w:pPr>
-      <w:bookmarkStart w:name="12-crm-khách-hàng-và-blacklist" w:id="1"/>
-      <w:r>
-        <w:t xml:space="preserve">12. CRM khách hàng và Blacklist</w:t>
+      <w:bookmarkStart w:name="12-production-credential-center" w:id="1"/>
+      <w:r>
+        <w:t xml:space="preserve">12. Production Credential Center</w:t>
       </w:r>
       <w:bookmarkEnd w:id="1"/>
     </w:p>
@@ -3190,38 +3496,42 @@
         </w:numPr>
         <w:numPr>
           <w:ilvl w:val="0"/>
-          <w:numId w:val="21"/>
-        </w:numPr>
-      </w:pPr>
-      <w:r>
-        <w:t xml:space="preserve">Khách hàng nếu bị đưa vào danh sách </w:t>
-      </w:r>
-      <w:r>
-        <w:rPr>
-          <w:b/>
-          <w:bCs/>
-        </w:rPr>
-        <w:t xml:space="preserve">Blacklist</w:t>
-      </w:r>
-      <w:r>
-        <w:t xml:space="preserve"> có thể làm đơn hàng tiếp theo của họ bị đánh dấu </w:t>
+          <w:numId w:val="24"/>
+        </w:numPr>
+      </w:pPr>
+      <w:r>
+        <w:rPr>
+          <w:b/>
+          <w:bCs/>
+        </w:rPr>
+        <w:t xml:space="preserve">Khái niệm:</w:t>
+      </w:r>
+      <w:r>
+        <w:t xml:space="preserve"> API key/credential là thông tin kết nối thật với đơn vị vận chuyển/nền tảng bên thứ ba (GHTK, GHN, J&amp;T).</w:t>
+      </w:r>
+    </w:p>
+    <w:p>
+      <w:pPr>
+        <w:pStyle w:val="ListParagraph"/>
+        <w:pStyle w:val="ListParagraph"/>
+        <w:numPr>
+          <w:ilvl w:val="0"/>
+          <w:numId w:val="1"/>
+        </w:numPr>
+        <w:numPr>
+          <w:ilvl w:val="0"/>
+          <w:numId w:val="24"/>
+        </w:numPr>
+      </w:pPr>
+      <w:r>
+        <w:t xml:space="preserve">Nếu thiếu thông tin này, hệ thống sẽ báo </w:t>
       </w:r>
       <w:r>
         <w:rPr>
           <w:rStyle w:val="code"/>
           <w:rFonts w:ascii="Consolas" w:cs="Consolas" w:eastAsia="Consolas" w:hAnsi="Consolas"/>
         </w:rPr>
-        <w:t xml:space="preserve">BLOCKED</w:t>
-      </w:r>
-      <w:r>
-        <w:t xml:space="preserve"> hoặc </w:t>
-      </w:r>
-      <w:r>
-        <w:rPr>
-          <w:rStyle w:val="code"/>
-          <w:rFonts w:ascii="Consolas" w:cs="Consolas" w:eastAsia="Consolas" w:hAnsi="Consolas"/>
-        </w:rPr>
-        <w:t xml:space="preserve">WAITING_APPROVAL</w:t>
+        <w:t xml:space="preserve">MISSING_CREDENTIALS</w:t>
       </w:r>
       <w:r>
         <w:t xml:space="preserve">.</w:t>
@@ -3237,28 +3547,28 @@
         </w:numPr>
         <w:numPr>
           <w:ilvl w:val="0"/>
-          <w:numId w:val="21"/>
-        </w:numPr>
-      </w:pPr>
-      <w:r>
-        <w:t xml:space="preserve">Admin cần vào xem xét lịch sử mua hàng trước khi quyết định xử lý.</w:t>
-      </w:r>
-    </w:p>
-    <w:p>
-      <w:pPr>
-        <w:pStyle w:val="ListParagraph"/>
-        <w:pStyle w:val="ListParagraph"/>
-        <w:numPr>
-          <w:ilvl w:val="0"/>
-          <w:numId w:val="1"/>
-        </w:numPr>
-        <w:numPr>
-          <w:ilvl w:val="0"/>
-          <w:numId w:val="21"/>
-        </w:numPr>
-      </w:pPr>
-      <w:r>
-        <w:t xml:space="preserve">Shop không thể tự tiện bỏ blacklist nếu không được Admin cấp quyền.</w:t>
+          <w:numId w:val="24"/>
+        </w:numPr>
+      </w:pPr>
+      <w:r>
+        <w:rPr>
+          <w:b/>
+          <w:bCs/>
+        </w:rPr>
+        <w:t xml:space="preserve">Lưu ý:</w:t>
+      </w:r>
+      <w:r>
+        <w:t xml:space="preserve"> Đây </w:t>
+      </w:r>
+      <w:r>
+        <w:rPr>
+          <w:b/>
+          <w:bCs/>
+        </w:rPr>
+        <w:t xml:space="preserve">không phải lỗi phần mềm</w:t>
+      </w:r>
+      <w:r>
+        <w:t xml:space="preserve">. Khi nhập đủ API key thật, hệ thống mới có thể đẩy vận chuyển thật (Không fake success).</w:t>
       </w:r>
     </w:p>
     <w:p>
@@ -3272,9 +3582,9 @@
       <w:pPr>
         <w:pStyle w:val="Heading1"/>
       </w:pPr>
-      <w:bookmarkStart w:name="13-dashboard-/-báo-cáo" w:id="1"/>
-      <w:r>
-        <w:t xml:space="preserve">13. Dashboard / Báo cáo</w:t>
+      <w:bookmarkStart w:name="12-crm-khách-hàng-và-blacklist" w:id="1"/>
+      <w:r>
+        <w:t xml:space="preserve">12. CRM khách hàng và Blacklist</w:t>
       </w:r>
       <w:bookmarkEnd w:id="1"/>
     </w:p>
@@ -3288,69 +3598,75 @@
         </w:numPr>
         <w:numPr>
           <w:ilvl w:val="0"/>
-          <w:numId w:val="22"/>
-        </w:numPr>
-      </w:pPr>
-      <w:r>
-        <w:rPr>
-          <w:b/>
-          <w:bCs/>
-        </w:rPr>
-        <w:t xml:space="preserve">Dashboard</w:t>
-      </w:r>
-      <w:r>
-        <w:t xml:space="preserve"> sẽ thống kê số liệu real-time từ đơn hàng thật.</w:t>
-      </w:r>
-    </w:p>
-    <w:p>
-      <w:pPr>
-        <w:pStyle w:val="ListParagraph"/>
-        <w:pStyle w:val="ListParagraph"/>
-        <w:numPr>
-          <w:ilvl w:val="0"/>
-          <w:numId w:val="1"/>
-        </w:numPr>
-        <w:numPr>
-          <w:ilvl w:val="0"/>
-          <w:numId w:val="22"/>
-        </w:numPr>
-      </w:pPr>
-      <w:r>
-        <w:t xml:space="preserve">Tổng phí vận chuyển lợi nhuận được hệ thống tính tự động từ cột </w:t>
+          <w:numId w:val="25"/>
+        </w:numPr>
+      </w:pPr>
+      <w:r>
+        <w:t xml:space="preserve">Khách hàng nếu bị đưa vào danh sách </w:t>
+      </w:r>
+      <w:r>
+        <w:rPr>
+          <w:b/>
+          <w:bCs/>
+        </w:rPr>
+        <w:t xml:space="preserve">Blacklist</w:t>
+      </w:r>
+      <w:r>
+        <w:t xml:space="preserve"> có thể làm đơn hàng tiếp theo của họ bị đánh dấu </w:t>
       </w:r>
       <w:r>
         <w:rPr>
           <w:rStyle w:val="code"/>
           <w:rFonts w:ascii="Consolas" w:cs="Consolas" w:eastAsia="Consolas" w:hAnsi="Consolas"/>
         </w:rPr>
-        <w:t xml:space="preserve">Order.shippingFee</w:t>
-      </w:r>
-      <w:r>
-        <w:t xml:space="preserve"> (được snapshot tại thời điểm đơn được tạo).</w:t>
-      </w:r>
-    </w:p>
-    <w:p>
-      <w:pPr>
-        <w:pStyle w:val="ListParagraph"/>
-        <w:pStyle w:val="ListParagraph"/>
-        <w:numPr>
-          <w:ilvl w:val="0"/>
-          <w:numId w:val="1"/>
-        </w:numPr>
-        <w:numPr>
-          <w:ilvl w:val="0"/>
-          <w:numId w:val="22"/>
-        </w:numPr>
-      </w:pPr>
-      <w:r>
-        <w:rPr>
-          <w:b/>
-          <w:bCs/>
-        </w:rPr>
-        <w:t xml:space="preserve">Việc thay đổi bảng giá sẽ không bao giờ làm đổi phí các đơn cũ</w:t>
-      </w:r>
-      <w:r>
-        <w:t xml:space="preserve">. Do đó, báo cáo lợi nhuận cũng sẽ không tự tính lại các đơn cũ theo bảng giá mới.</w:t>
+        <w:t xml:space="preserve">BLOCKED</w:t>
+      </w:r>
+      <w:r>
+        <w:t xml:space="preserve"> hoặc </w:t>
+      </w:r>
+      <w:r>
+        <w:rPr>
+          <w:rStyle w:val="code"/>
+          <w:rFonts w:ascii="Consolas" w:cs="Consolas" w:eastAsia="Consolas" w:hAnsi="Consolas"/>
+        </w:rPr>
+        <w:t xml:space="preserve">WAITING_APPROVAL</w:t>
+      </w:r>
+      <w:r>
+        <w:t xml:space="preserve">.</w:t>
+      </w:r>
+    </w:p>
+    <w:p>
+      <w:pPr>
+        <w:pStyle w:val="ListParagraph"/>
+        <w:pStyle w:val="ListParagraph"/>
+        <w:numPr>
+          <w:ilvl w:val="0"/>
+          <w:numId w:val="1"/>
+        </w:numPr>
+        <w:numPr>
+          <w:ilvl w:val="0"/>
+          <w:numId w:val="25"/>
+        </w:numPr>
+      </w:pPr>
+      <w:r>
+        <w:t xml:space="preserve">Admin cần vào xem xét lịch sử mua hàng trước khi quyết định xử lý.</w:t>
+      </w:r>
+    </w:p>
+    <w:p>
+      <w:pPr>
+        <w:pStyle w:val="ListParagraph"/>
+        <w:pStyle w:val="ListParagraph"/>
+        <w:numPr>
+          <w:ilvl w:val="0"/>
+          <w:numId w:val="1"/>
+        </w:numPr>
+        <w:numPr>
+          <w:ilvl w:val="0"/>
+          <w:numId w:val="25"/>
+        </w:numPr>
+      </w:pPr>
+      <w:r>
+        <w:t xml:space="preserve">Shop không thể tự tiện bỏ blacklist nếu không được Admin cấp quyền.</w:t>
       </w:r>
     </w:p>
     <w:p>
@@ -3364,6 +3680,98 @@
       <w:pPr>
         <w:pStyle w:val="Heading1"/>
       </w:pPr>
+      <w:bookmarkStart w:name="13-dashboard-/-báo-cáo" w:id="1"/>
+      <w:r>
+        <w:t xml:space="preserve">13. Dashboard / Báo cáo</w:t>
+      </w:r>
+      <w:bookmarkEnd w:id="1"/>
+    </w:p>
+    <w:p>
+      <w:pPr>
+        <w:pStyle w:val="ListParagraph"/>
+        <w:pStyle w:val="ListParagraph"/>
+        <w:numPr>
+          <w:ilvl w:val="0"/>
+          <w:numId w:val="1"/>
+        </w:numPr>
+        <w:numPr>
+          <w:ilvl w:val="0"/>
+          <w:numId w:val="26"/>
+        </w:numPr>
+      </w:pPr>
+      <w:r>
+        <w:rPr>
+          <w:b/>
+          <w:bCs/>
+        </w:rPr>
+        <w:t xml:space="preserve">Dashboard</w:t>
+      </w:r>
+      <w:r>
+        <w:t xml:space="preserve"> sẽ thống kê số liệu real-time từ đơn hàng thật.</w:t>
+      </w:r>
+    </w:p>
+    <w:p>
+      <w:pPr>
+        <w:pStyle w:val="ListParagraph"/>
+        <w:pStyle w:val="ListParagraph"/>
+        <w:numPr>
+          <w:ilvl w:val="0"/>
+          <w:numId w:val="1"/>
+        </w:numPr>
+        <w:numPr>
+          <w:ilvl w:val="0"/>
+          <w:numId w:val="26"/>
+        </w:numPr>
+      </w:pPr>
+      <w:r>
+        <w:t xml:space="preserve">Tổng phí vận chuyển lợi nhuận được hệ thống tính tự động từ cột </w:t>
+      </w:r>
+      <w:r>
+        <w:rPr>
+          <w:rStyle w:val="code"/>
+          <w:rFonts w:ascii="Consolas" w:cs="Consolas" w:eastAsia="Consolas" w:hAnsi="Consolas"/>
+        </w:rPr>
+        <w:t xml:space="preserve">Order.shippingFee</w:t>
+      </w:r>
+      <w:r>
+        <w:t xml:space="preserve"> (được snapshot tại thời điểm đơn được tạo).</w:t>
+      </w:r>
+    </w:p>
+    <w:p>
+      <w:pPr>
+        <w:pStyle w:val="ListParagraph"/>
+        <w:pStyle w:val="ListParagraph"/>
+        <w:numPr>
+          <w:ilvl w:val="0"/>
+          <w:numId w:val="1"/>
+        </w:numPr>
+        <w:numPr>
+          <w:ilvl w:val="0"/>
+          <w:numId w:val="26"/>
+        </w:numPr>
+      </w:pPr>
+      <w:r>
+        <w:rPr>
+          <w:b/>
+          <w:bCs/>
+        </w:rPr>
+        <w:t xml:space="preserve">Việc thay đổi bảng giá sẽ không bao giờ làm đổi phí các đơn cũ</w:t>
+      </w:r>
+      <w:r>
+        <w:t xml:space="preserve">. Do đó, báo cáo lợi nhuận cũng sẽ không tự tính lại các đơn cũ theo bảng giá mới.</w:t>
+      </w:r>
+    </w:p>
+    <w:p>
+      <w:pPr>
+        <w:pBdr>
+          <w:top w:val="single" w:sz="6"/>
+        </w:pBdr>
+      </w:pPr>
+    </w:p>
+    <w:p>
+      <w:pPr>
+        <w:pStyle w:val="Heading1"/>
+      </w:pPr>
       <w:bookmarkStart w:name="14-checklist-uat-cho-khách" w:id="1"/>
       <w:r>
         <w:t xml:space="preserve">14. Checklist UAT cho khách</w:t>
@@ -3390,7 +3798,7 @@
         </w:numPr>
         <w:numPr>
           <w:ilvl w:val="0"/>
-          <w:numId w:val="23"/>
+          <w:numId w:val="27"/>
         </w:numPr>
       </w:pPr>
       <w:sdt>
@@ -3424,7 +3832,7 @@
         </w:numPr>
         <w:numPr>
           <w:ilvl w:val="0"/>
-          <w:numId w:val="23"/>
+          <w:numId w:val="27"/>
         </w:numPr>
       </w:pPr>
       <w:sdt>
@@ -3458,7 +3866,7 @@
         </w:numPr>
         <w:numPr>
           <w:ilvl w:val="0"/>
-          <w:numId w:val="23"/>
+          <w:numId w:val="27"/>
         </w:numPr>
       </w:pPr>
       <w:sdt>
@@ -3492,7 +3900,7 @@
         </w:numPr>
         <w:numPr>
           <w:ilvl w:val="0"/>
-          <w:numId w:val="23"/>
+          <w:numId w:val="27"/>
         </w:numPr>
       </w:pPr>
       <w:sdt>
@@ -3526,7 +3934,7 @@
         </w:numPr>
         <w:numPr>
           <w:ilvl w:val="0"/>
-          <w:numId w:val="23"/>
+          <w:numId w:val="27"/>
         </w:numPr>
       </w:pPr>
       <w:sdt>
@@ -3560,7 +3968,7 @@
         </w:numPr>
         <w:numPr>
           <w:ilvl w:val="0"/>
-          <w:numId w:val="23"/>
+          <w:numId w:val="27"/>
         </w:numPr>
       </w:pPr>
       <w:sdt>
@@ -3604,7 +4012,7 @@
         </w:numPr>
         <w:numPr>
           <w:ilvl w:val="0"/>
-          <w:numId w:val="24"/>
+          <w:numId w:val="28"/>
         </w:numPr>
       </w:pPr>
       <w:sdt>
@@ -3638,7 +4046,7 @@
         </w:numPr>
         <w:numPr>
           <w:ilvl w:val="0"/>
-          <w:numId w:val="24"/>
+          <w:numId w:val="28"/>
         </w:numPr>
       </w:pPr>
       <w:sdt>
@@ -3672,7 +4080,7 @@
         </w:numPr>
         <w:numPr>
           <w:ilvl w:val="0"/>
-          <w:numId w:val="24"/>
+          <w:numId w:val="28"/>
         </w:numPr>
       </w:pPr>
       <w:sdt>
@@ -3706,7 +4114,7 @@
         </w:numPr>
         <w:numPr>
           <w:ilvl w:val="0"/>
-          <w:numId w:val="24"/>
+          <w:numId w:val="28"/>
         </w:numPr>
       </w:pPr>
       <w:sdt>
@@ -3740,7 +4148,7 @@
         </w:numPr>
         <w:numPr>
           <w:ilvl w:val="0"/>
-          <w:numId w:val="24"/>
+          <w:numId w:val="28"/>
         </w:numPr>
       </w:pPr>
       <w:sdt>
@@ -3774,7 +4182,7 @@
         </w:numPr>
         <w:numPr>
           <w:ilvl w:val="0"/>
-          <w:numId w:val="24"/>
+          <w:numId w:val="28"/>
         </w:numPr>
       </w:pPr>
       <w:sdt>
@@ -3818,7 +4226,7 @@
         </w:numPr>
         <w:numPr>
           <w:ilvl w:val="0"/>
-          <w:numId w:val="25"/>
+          <w:numId w:val="29"/>
         </w:numPr>
       </w:pPr>
       <w:sdt>
@@ -3862,7 +4270,7 @@
         </w:numPr>
         <w:numPr>
           <w:ilvl w:val="0"/>
-          <w:numId w:val="25"/>
+          <w:numId w:val="29"/>
         </w:numPr>
       </w:pPr>
       <w:sdt>
@@ -3906,7 +4314,7 @@
         </w:numPr>
         <w:numPr>
           <w:ilvl w:val="0"/>
-          <w:numId w:val="25"/>
+          <w:numId w:val="29"/>
         </w:numPr>
       </w:pPr>
       <w:sdt>
@@ -3950,7 +4358,7 @@
         </w:numPr>
         <w:numPr>
           <w:ilvl w:val="0"/>
-          <w:numId w:val="25"/>
+          <w:numId w:val="29"/>
         </w:numPr>
       </w:pPr>
       <w:sdt>
@@ -3994,7 +4402,7 @@
         </w:numPr>
         <w:numPr>
           <w:ilvl w:val="0"/>
-          <w:numId w:val="25"/>
+          <w:numId w:val="29"/>
         </w:numPr>
       </w:pPr>
       <w:sdt>
@@ -4038,7 +4446,7 @@
         </w:numPr>
         <w:numPr>
           <w:ilvl w:val="0"/>
-          <w:numId w:val="25"/>
+          <w:numId w:val="29"/>
         </w:numPr>
       </w:pPr>
       <w:sdt>
@@ -4082,7 +4490,7 @@
         </w:numPr>
         <w:numPr>
           <w:ilvl w:val="0"/>
-          <w:numId w:val="26"/>
+          <w:numId w:val="30"/>
         </w:numPr>
       </w:pPr>
       <w:sdt>
@@ -4116,7 +4524,7 @@
         </w:numPr>
         <w:numPr>
           <w:ilvl w:val="0"/>
-          <w:numId w:val="26"/>
+          <w:numId w:val="30"/>
         </w:numPr>
       </w:pPr>
       <w:sdt>
@@ -4150,7 +4558,7 @@
         </w:numPr>
         <w:numPr>
           <w:ilvl w:val="0"/>
-          <w:numId w:val="26"/>
+          <w:numId w:val="30"/>
         </w:numPr>
       </w:pPr>
       <w:sdt>
@@ -4184,7 +4592,7 @@
         </w:numPr>
         <w:numPr>
           <w:ilvl w:val="0"/>
-          <w:numId w:val="26"/>
+          <w:numId w:val="30"/>
         </w:numPr>
       </w:pPr>
       <w:sdt>
@@ -4218,7 +4626,7 @@
         </w:numPr>
         <w:numPr>
           <w:ilvl w:val="0"/>
-          <w:numId w:val="26"/>
+          <w:numId w:val="30"/>
         </w:numPr>
       </w:pPr>
       <w:sdt>
@@ -4647,7 +5055,7 @@
         </w:numPr>
         <w:numPr>
           <w:ilvl w:val="0"/>
-          <w:numId w:val="27"/>
+          <w:numId w:val="31"/>
         </w:numPr>
       </w:pPr>
       <w:r>
@@ -4671,7 +5079,7 @@
         </w:numPr>
         <w:numPr>
           <w:ilvl w:val="0"/>
-          <w:numId w:val="27"/>
+          <w:numId w:val="31"/>
         </w:numPr>
       </w:pPr>
       <w:r>
@@ -4695,7 +5103,7 @@
         </w:numPr>
         <w:numPr>
           <w:ilvl w:val="0"/>
-          <w:numId w:val="27"/>
+          <w:numId w:val="31"/>
         </w:numPr>
       </w:pPr>
       <w:r>
@@ -4729,7 +5137,7 @@
         </w:numPr>
         <w:numPr>
           <w:ilvl w:val="0"/>
-          <w:numId w:val="27"/>
+          <w:numId w:val="31"/>
         </w:numPr>
       </w:pPr>
       <w:r>
@@ -4787,7 +5195,7 @@
         </w:numPr>
         <w:numPr>
           <w:ilvl w:val="0"/>
-          <w:numId w:val="28"/>
+          <w:numId w:val="32"/>
         </w:numPr>
       </w:pPr>
       <w:r>
@@ -4814,7 +5222,7 @@
         </w:numPr>
         <w:numPr>
           <w:ilvl w:val="0"/>
-          <w:numId w:val="28"/>
+          <w:numId w:val="32"/>
         </w:numPr>
       </w:pPr>
       <w:r>
@@ -4831,7 +5239,7 @@
         </w:numPr>
         <w:numPr>
           <w:ilvl w:val="0"/>
-          <w:numId w:val="28"/>
+          <w:numId w:val="32"/>
         </w:numPr>
       </w:pPr>
       <w:r>
@@ -4868,7 +5276,7 @@
         </w:numPr>
         <w:numPr>
           <w:ilvl w:val="0"/>
-          <w:numId w:val="28"/>
+          <w:numId w:val="32"/>
         </w:numPr>
       </w:pPr>
       <w:r>
@@ -4895,7 +5303,7 @@
         </w:numPr>
         <w:numPr>
           <w:ilvl w:val="0"/>
-          <w:numId w:val="28"/>
+          <w:numId w:val="32"/>
         </w:numPr>
       </w:pPr>
       <w:r>
@@ -4949,7 +5357,7 @@
         </w:numPr>
         <w:numPr>
           <w:ilvl w:val="0"/>
-          <w:numId w:val="29"/>
+          <w:numId w:val="33"/>
         </w:numPr>
       </w:pPr>
       <w:r>
@@ -4966,7 +5374,7 @@
         </w:numPr>
         <w:numPr>
           <w:ilvl w:val="0"/>
-          <w:numId w:val="29"/>
+          <w:numId w:val="33"/>
         </w:numPr>
       </w:pPr>
       <w:r>
@@ -4993,7 +5401,7 @@
         </w:numPr>
         <w:numPr>
           <w:ilvl w:val="0"/>
-          <w:numId w:val="29"/>
+          <w:numId w:val="33"/>
         </w:numPr>
       </w:pPr>
       <w:r>
@@ -5020,7 +5428,7 @@
         </w:numPr>
         <w:numPr>
           <w:ilvl w:val="0"/>
-          <w:numId w:val="29"/>
+          <w:numId w:val="33"/>
         </w:numPr>
       </w:pPr>
       <w:r>
@@ -5037,7 +5445,7 @@
         </w:numPr>
         <w:numPr>
           <w:ilvl w:val="0"/>
-          <w:numId w:val="29"/>
+          <w:numId w:val="33"/>
         </w:numPr>
       </w:pPr>
       <w:r>
@@ -5054,7 +5462,7 @@
         </w:numPr>
         <w:numPr>
           <w:ilvl w:val="0"/>
-          <w:numId w:val="29"/>
+          <w:numId w:val="33"/>
         </w:numPr>
       </w:pPr>
       <w:r>
@@ -5071,7 +5479,7 @@
         </w:numPr>
         <w:numPr>
           <w:ilvl w:val="0"/>
-          <w:numId w:val="29"/>
+          <w:numId w:val="33"/>
         </w:numPr>
       </w:pPr>
       <w:r>
@@ -5088,7 +5496,7 @@
         </w:numPr>
         <w:numPr>
           <w:ilvl w:val="0"/>
-          <w:numId w:val="29"/>
+          <w:numId w:val="33"/>
         </w:numPr>
       </w:pPr>
       <w:r>
@@ -5595,6 +6003,30 @@
     </w:lvlOverride>
   </w:num>
   <w:num w:numId="29">
+    <w:abstractNumId w:val="5"/>
+    <w:lvlOverride w:ilvl="0">
+      <w:startOverride w:val="1"/>
+    </w:lvlOverride>
+  </w:num>
+  <w:num w:numId="30">
+    <w:abstractNumId w:val="5"/>
+    <w:lvlOverride w:ilvl="0">
+      <w:startOverride w:val="1"/>
+    </w:lvlOverride>
+  </w:num>
+  <w:num w:numId="31">
+    <w:abstractNumId w:val="5"/>
+    <w:lvlOverride w:ilvl="0">
+      <w:startOverride w:val="1"/>
+    </w:lvlOverride>
+  </w:num>
+  <w:num w:numId="32">
+    <w:abstractNumId w:val="5"/>
+    <w:lvlOverride w:ilvl="0">
+      <w:startOverride w:val="1"/>
+    </w:lvlOverride>
+  </w:num>
+  <w:num w:numId="33">
     <w:abstractNumId w:val="5"/>
     <w:lvlOverride w:ilvl="0">
       <w:startOverride w:val="1"/>

</xml_diff>